<commit_message>
proposal v0.63: add synthetic persona smoke pack
</commit_message>
<xml_diff>
--- a/deliverables/AskInfer-Bench_两周执行Todo与任务手册.docx
+++ b/deliverables/AskInfer-Bench_两周执行Todo与任务手册.docx
@@ -131,7 +131,7 @@
                 <w:color w:val="5B6B7A"/>
                 <w:sz w:val="21"/>
               </w:rPr>
-              <w:t>v0.62 · 两周执行冻结</w:t>
+              <w:t>v0.63 · S0 smoke 已生成</w:t>
             </w:r>
           </w:p>
         </w:tc>
@@ -189,7 +189,7 @@
                 <w:color w:val="5B6B7A"/>
                 <w:sz w:val="21"/>
               </w:rPr>
-              <w:t>2026 年 9 月 3 日</w:t>
+              <w:t>2026 年 9 月 4 日</w:t>
             </w:r>
           </w:p>
         </w:tc>
@@ -3392,7 +3392,7 @@
                 <w:rFonts w:ascii="Calibri" w:hAnsi="Calibri" w:eastAsia="PingFang SC"/>
                 <w:sz w:val="16"/>
               </w:rPr>
-              <w:t>尚未创建</w:t>
+              <w:t>4 题 8 个 LLM candidate 已生成</w:t>
             </w:r>
           </w:p>
         </w:tc>
@@ -3418,7 +3418,7 @@
                 <w:rFonts w:ascii="Calibri" w:hAnsi="Calibri" w:eastAsia="PingFang SC"/>
                 <w:sz w:val="16"/>
               </w:rPr>
-              <w:t>否</w:t>
+              <w:t>只可 S0 smoke</w:t>
             </w:r>
           </w:p>
         </w:tc>
@@ -3444,7 +3444,7 @@
                 <w:rFonts w:ascii="Calibri" w:hAnsi="Calibri" w:eastAsia="PingFang SC"/>
                 <w:sz w:val="16"/>
               </w:rPr>
-              <w:t>LLM 生成 task-conditioned candidate；两人逐项确认后才能冻结</w:t>
+              <w:t>两人逐项确认后才能进入 counted episode</w:t>
             </w:r>
           </w:p>
         </w:tc>
@@ -3501,7 +3501,7 @@
                 <w:rFonts w:ascii="Calibri" w:hAnsi="Calibri" w:eastAsia="PingFang SC"/>
                 <w:sz w:val="16"/>
               </w:rPr>
-              <w:t>已完成通用模板</w:t>
+              <w:t>4 套候选粗/细 rubric 已生成</w:t>
             </w:r>
           </w:p>
         </w:tc>
@@ -3527,7 +3527,7 @@
                 <w:rFonts w:ascii="Calibri" w:hAnsi="Calibri" w:eastAsia="PingFang SC"/>
                 <w:sz w:val="16"/>
               </w:rPr>
-              <w:t>否</w:t>
+              <w:t>只可 S0 结构测试</w:t>
             </w:r>
           </w:p>
         </w:tc>
@@ -3553,7 +3553,7 @@
                 <w:rFonts w:ascii="Calibri" w:hAnsi="Calibri" w:eastAsia="PingFang SC"/>
                 <w:sz w:val="16"/>
               </w:rPr>
-              <w:t>每个 case 编译 12–20 条任务特异 leaf，运行前哈希冻结</w:t>
+              <w:t>补真实 verifier evidence；两人复核后哈希冻结</w:t>
             </w:r>
           </w:p>
         </w:tc>
@@ -4237,7 +4237,22 @@
                 <w:rFonts w:ascii="Calibri" w:hAnsi="Calibri" w:eastAsia="PingFang SC"/>
                 <w:sz w:val="16"/>
               </w:rPr>
-              <w:t>未安装</w:t>
+              <w:t xml:space="preserve">已安装 </w:t>
+            </w:r>
+            <w:r>
+              <w:rPr>
+                <w:rFonts w:ascii="Courier New" w:hAnsi="Courier New" w:eastAsia="PingFang SC"/>
+                <w:color w:val="6A3E00"/>
+                <w:sz w:val="16"/>
+              </w:rPr>
+              <w:t>0.46.0</w:t>
+            </w:r>
+            <w:r>
+              <w:rPr>
+                <w:rFonts w:ascii="Calibri" w:hAnsi="Calibri" w:eastAsia="PingFang SC"/>
+                <w:sz w:val="16"/>
+              </w:rPr>
+              <w:t>；OAuth 待本人登录</w:t>
             </w:r>
           </w:p>
         </w:tc>
@@ -4289,7 +4304,7 @@
                 <w:rFonts w:ascii="Calibri" w:hAnsi="Calibri" w:eastAsia="PingFang SC"/>
                 <w:sz w:val="16"/>
               </w:rPr>
-              <w:t>9 月 6 日前完成安装、鉴权和三域 smoke，否则主榜改为两产品+一个受控 baseline</w:t>
+              <w:t>完成鉴权和三域 smoke；记录 Homebrew 渠道弃用警告、实际模型与账户类型</w:t>
             </w:r>
           </w:p>
         </w:tc>
@@ -4481,6 +4496,114 @@
           <w:rFonts w:ascii="Calibri" w:hAnsi="Calibri" w:eastAsia="PingFang SC"/>
         </w:rPr>
         <w:t>不要求全实验一天跑完；目标是 48–72 小时完成同一批次，并用 5%–10% anchor 重跑检测时间漂移。</w:t>
+      </w:r>
+    </w:p>
+    <w:p>
+      <w:pPr>
+        <w:pStyle w:val="Heading2"/>
+      </w:pPr>
+      <w:r>
+        <w:t>3.5 今天立刻执行的 S0 smoke</w:t>
+      </w:r>
+    </w:p>
+    <w:p>
+      <w:r>
+        <w:rPr>
+          <w:rFonts w:ascii="Calibri" w:hAnsi="Calibri" w:eastAsia="PingFang SC"/>
+        </w:rPr>
+        <w:t xml:space="preserve">入口是 </w:t>
+      </w:r>
+      <w:r>
+        <w:rPr>
+          <w:rFonts w:ascii="Courier New" w:hAnsi="Courier New" w:eastAsia="PingFang SC"/>
+          <w:color w:val="6A3E00"/>
+          <w:sz w:val="20"/>
+        </w:rPr>
+        <w:t>pilot/askinfer_smoke_v0_63/README.md</w:t>
+      </w:r>
+      <w:r>
+        <w:rPr>
+          <w:rFonts w:ascii="Calibri" w:hAnsi="Calibri" w:eastAsia="PingFang SC"/>
+        </w:rPr>
+        <w:t xml:space="preserve"> 和 </w:t>
+      </w:r>
+      <w:r>
+        <w:rPr>
+          <w:rFonts w:ascii="Courier New" w:hAnsi="Courier New" w:eastAsia="PingFang SC"/>
+          <w:color w:val="6A3E00"/>
+          <w:sz w:val="20"/>
+        </w:rPr>
+        <w:t>RUNBOOK.md</w:t>
+      </w:r>
+      <w:r>
+        <w:rPr>
+          <w:rFonts w:ascii="Calibri" w:hAnsi="Calibri" w:eastAsia="PingFang SC"/>
+        </w:rPr>
+        <w:t xml:space="preserve">。包内已有 SW001、SW013、DA003、DA015 的 8 个 synthetic A/B user states、4 套 100 分粗/细 rubric、隐藏 simulator ledger、三个可复制 prompt 和人工 scorecard。先运行 </w:t>
+      </w:r>
+      <w:r>
+        <w:rPr>
+          <w:rFonts w:ascii="Courier New" w:hAnsi="Courier New" w:eastAsia="PingFang SC"/>
+          <w:color w:val="6A3E00"/>
+          <w:sz w:val="20"/>
+        </w:rPr>
+        <w:t>python3 pilot/askinfer_smoke_v0_63/validate_pack.py</w:t>
+      </w:r>
+      <w:r>
+        <w:rPr>
+          <w:rFonts w:ascii="Calibri" w:hAnsi="Calibri" w:eastAsia="PingFang SC"/>
+        </w:rPr>
+        <w:t>，再让 Codex 与 Claude 各跑 Research/Code/Data 三题；Gemini 完成本人 OAuth 后补跑。</w:t>
+      </w:r>
+    </w:p>
+    <w:p>
+      <w:r>
+        <w:rPr>
+          <w:rFonts w:ascii="Calibri" w:hAnsi="Calibri" w:eastAsia="PingFang SC"/>
+        </w:rPr>
+        <w:t xml:space="preserve">S0 只验 </w:t>
+      </w:r>
+      <w:r>
+        <w:rPr>
+          <w:rFonts w:ascii="Courier New" w:hAnsi="Courier New" w:eastAsia="PingFang SC"/>
+          <w:color w:val="6A3E00"/>
+          <w:sz w:val="20"/>
+        </w:rPr>
+        <w:t>&lt;ASK&gt;/&lt;FINAL&gt;</w:t>
+      </w:r>
+      <w:r>
+        <w:rPr>
+          <w:rFonts w:ascii="Calibri" w:hAnsi="Calibri" w:eastAsia="PingFang SC"/>
+        </w:rPr>
+        <w:t>、high-</w:t>
+      </w:r>
+      <w:r>
+        <w:rPr>
+          <w:rFonts w:ascii="Courier New" w:hAnsi="Courier New" w:eastAsia="PingFang SC"/>
+          <w:color w:val="6A3E00"/>
+          <w:sz w:val="20"/>
+        </w:rPr>
+        <w:t>δ</w:t>
+      </w:r>
+      <w:r>
+        <w:rPr>
+          <w:rFonts w:ascii="Calibri" w:hAnsi="Calibri" w:eastAsia="PingFang SC"/>
+        </w:rPr>
+        <w:t xml:space="preserve"> question targeting、ledger-bounded answer、具体 decision use、trace 和 reset。SW001/SW013/DA003/DA015 的真实 repo/dataset binding 仍是 </w:t>
+      </w:r>
+      <w:r>
+        <w:rPr>
+          <w:rFonts w:ascii="Courier New" w:hAnsi="Courier New" w:eastAsia="PingFang SC"/>
+          <w:color w:val="6A3E00"/>
+          <w:sz w:val="20"/>
+        </w:rPr>
+        <w:t>pending</w:t>
+      </w:r>
+      <w:r>
+        <w:rPr>
+          <w:rFonts w:ascii="Calibri" w:hAnsi="Calibri" w:eastAsia="PingFang SC"/>
+        </w:rPr>
+        <w:t>，所以 S0 通过后必须搭 S1 fixture；不能把计划文本或关键词写入当成代码/notebook 完成。任何正式计分前，还要让两名独立验证者逐 node 确认并冻结。</w:t>
       </w:r>
     </w:p>
     <w:p>
@@ -18676,7 +18799,7 @@
         <w:color w:val="5B6B7A"/>
         <w:sz w:val="18"/>
       </w:rPr>
-      <w:t xml:space="preserve">2026-9-3   ·   </w:t>
+      <w:t xml:space="preserve">2026-9-4   ·   </w:t>
     </w:r>
     <w:r>
       <w:rPr>
@@ -18709,7 +18832,7 @@
         <w:color w:val="5B6B7A"/>
         <w:sz w:val="18"/>
       </w:rPr>
-      <w:t xml:space="preserve">2026-9-3   ·   </w:t>
+      <w:t xml:space="preserve">2026-9-4   ·   </w:t>
     </w:r>
     <w:r>
       <w:rPr>
@@ -18742,7 +18865,7 @@
         <w:color w:val="5B6B7A"/>
         <w:sz w:val="18"/>
       </w:rPr>
-      <w:t xml:space="preserve">2026-9-3   ·   </w:t>
+      <w:t xml:space="preserve">2026-9-4   ·   </w:t>
     </w:r>
     <w:r>
       <w:rPr>

</xml_diff>

<commit_message>
proposal v0.64: record first live S0 runs
</commit_message>
<xml_diff>
--- a/deliverables/AskInfer-Bench_两周执行Todo与任务手册.docx
+++ b/deliverables/AskInfer-Bench_两周执行Todo与任务手册.docx
@@ -131,7 +131,7 @@
                 <w:color w:val="5B6B7A"/>
                 <w:sz w:val="21"/>
               </w:rPr>
-              <w:t>v0.63 · S0 smoke 已生成</w:t>
+              <w:t>v0.64 · 首轮 live S0</w:t>
             </w:r>
           </w:p>
         </w:tc>
@@ -4130,6 +4130,13 @@
               </w:rPr>
               <w:t>2.1.221</w:t>
             </w:r>
+            <w:r>
+              <w:rPr>
+                <w:rFonts w:ascii="Calibri" w:hAnsi="Calibri" w:eastAsia="PingFang SC"/>
+                <w:sz w:val="16"/>
+              </w:rPr>
+              <w:t>；当前企业账户余额不足</w:t>
+            </w:r>
           </w:p>
         </w:tc>
         <w:tc>
@@ -4180,7 +4187,7 @@
                 <w:rFonts w:ascii="Calibri" w:hAnsi="Calibri" w:eastAsia="PingFang SC"/>
                 <w:sz w:val="16"/>
               </w:rPr>
-              <w:t>三域 smoke 全过；关闭跨 episode memory；冻结 alias 对应的实际 model</w:t>
+              <w:t>修复鉴权后用全新 session 跑三域 smoke；关闭跨 episode memory；冻结实际 model</w:t>
             </w:r>
           </w:p>
         </w:tc>
@@ -4539,7 +4546,7 @@
         <w:rPr>
           <w:rFonts w:ascii="Calibri" w:hAnsi="Calibri" w:eastAsia="PingFang SC"/>
         </w:rPr>
-        <w:t xml:space="preserve">。包内已有 SW001、SW013、DA003、DA015 的 8 个 synthetic A/B user states、4 套 100 分粗/细 rubric、隐藏 simulator ledger、三个可复制 prompt 和人工 scorecard。先运行 </w:t>
+        <w:t xml:space="preserve">。包内已有 SW001、SW013、DA003、DA015 的 8 个 synthetic A/B user states、4 套 100 分粗/细 rubric、隐藏 simulator ledger、三个可复制 prompt 和人工 scorecard。第一批结果位于 </w:t>
       </w:r>
       <w:r>
         <w:rPr>
@@ -4547,13 +4554,13 @@
           <w:color w:val="6A3E00"/>
           <w:sz w:val="20"/>
         </w:rPr>
-        <w:t>python3 pilot/askinfer_smoke_v0_63/validate_pack.py</w:t>
+        <w:t>runs/s0/20260904_cli6_smoke_v0_63/</w:t>
       </w:r>
       <w:r>
         <w:rPr>
           <w:rFonts w:ascii="Calibri" w:hAnsi="Calibri" w:eastAsia="PingFang SC"/>
         </w:rPr>
-        <w:t>，再让 Codex 与 Claude 各跑 Research/Code/Data 三题；Gemini 完成本人 OAuth 后补跑。</w:t>
+        <w:t>：Codex Research PASS、Code PASS with warning、Data FAIL；Claude 三题因 401 企业余额不足未进入模型，不能计能力分。下一步先修复 Claude 鉴权并用全新 session 补三题；Gemini 完成本人 OAuth 后再补三题。</w:t>
       </w:r>
     </w:p>
     <w:p>

</xml_diff>

<commit_message>
proposal v0.65: run PDR interactive personalization pilot
</commit_message>
<xml_diff>
--- a/deliverables/AskInfer-Bench_两周执行Todo与任务手册.docx
+++ b/deliverables/AskInfer-Bench_两周执行Todo与任务手册.docx
@@ -131,7 +131,7 @@
                 <w:color w:val="5B6B7A"/>
                 <w:sz w:val="21"/>
               </w:rPr>
-              <w:t>v0.64 · 首轮 live S0</w:t>
+              <w:t>v0.65 · PDR-T30 最小产品闭环</w:t>
             </w:r>
           </w:p>
         </w:tc>
@@ -189,7 +189,7 @@
                 <w:color w:val="5B6B7A"/>
                 <w:sz w:val="21"/>
               </w:rPr>
-              <w:t>2026 年 9 月 4 日</w:t>
+              <w:t>2026 年 9 月 5 日</w:t>
             </w:r>
           </w:p>
         </w:tc>
@@ -6025,6 +6025,21 @@
           <w:rFonts w:ascii="Calibri" w:hAnsi="Calibri" w:eastAsia="PingFang SC"/>
         </w:rPr>
         <w:t>：两名人工复核 task-persona compatibility；对任何无法由 persona 原文支持的目标标为 missing_askable，而不是 compiler inference。</w:t>
+      </w:r>
+    </w:p>
+    <w:p>
+      <w:r>
+        <w:rPr>
+          <w:rFonts w:ascii="Calibri" w:hAnsi="Calibri" w:eastAsia="PingFang SC"/>
+          <w:b/>
+        </w:rPr>
+        <w:t>v0.65 最小运行结果</w:t>
+      </w:r>
+      <w:r>
+        <w:rPr>
+          <w:rFonts w:ascii="Calibri" w:hAnsi="Calibri" w:eastAsia="PingFang SC"/>
+        </w:rPr>
+        <w:t>：已先用 User12 × ChatGPT Deep Research 跑通 Full Persona、No-Ask 和 Free Clarification。P-score 分别为 6.703、5.596、6.033；InteractiveGain=+0.438，RecoveryRatio=39.53%。Interactive 的六问全部 task-relevant，但只恢复了内容方向、目标优先级、晨间/周末时间和 ROI；没有询问 founder/company role、技术资历、LinkedIn/GitHub/Slack/Notion、跨境与合规边界。该运行用于验证 end-to-end plumbing 和 acquisition-to-use 诊断，不替代 A/B pair、high/low/zero node、双人 qualification 或 matched/swapped 主评。</w:t>
       </w:r>
     </w:p>
     <w:p>
@@ -18806,7 +18821,7 @@
         <w:color w:val="5B6B7A"/>
         <w:sz w:val="18"/>
       </w:rPr>
-      <w:t xml:space="preserve">2026-9-4   ·   </w:t>
+      <w:t xml:space="preserve">2026-9-5   ·   </w:t>
     </w:r>
     <w:r>
       <w:rPr>
@@ -18839,7 +18854,7 @@
         <w:color w:val="5B6B7A"/>
         <w:sz w:val="18"/>
       </w:rPr>
-      <w:t xml:space="preserve">2026-9-4   ·   </w:t>
+      <w:t xml:space="preserve">2026-9-5   ·   </w:t>
     </w:r>
     <w:r>
       <w:rPr>
@@ -18872,7 +18887,7 @@
         <w:color w:val="5B6B7A"/>
         <w:sz w:val="18"/>
       </w:rPr>
-      <w:t xml:space="preserve">2026-9-4   ·   </w:t>
+      <w:t xml:space="preserve">2026-9-5   ·   </w:t>
     </w:r>
     <w:r>
       <w:rPr>

</xml_diff>

<commit_message>
proposal v0.66: add two-agent clarification pilot
</commit_message>
<xml_diff>
--- a/deliverables/AskInfer-Bench_两周执行Todo与任务手册.docx
+++ b/deliverables/AskInfer-Bench_两周执行Todo与任务手册.docx
@@ -131,7 +131,7 @@
                 <w:color w:val="5B6B7A"/>
                 <w:sz w:val="21"/>
               </w:rPr>
-              <w:t>v0.65 · PDR-T30 最小产品闭环</w:t>
+              <w:t>v0.66 · PDR-T01 双 Agent 澄清 Pilot</w:t>
             </w:r>
           </w:p>
         </w:tc>
@@ -189,7 +189,7 @@
                 <w:color w:val="5B6B7A"/>
                 <w:sz w:val="21"/>
               </w:rPr>
-              <w:t>2026 年 9 月 5 日</w:t>
+              <w:t>2026 年 9 月 6 日</w:t>
             </w:r>
           </w:p>
         </w:tc>
@@ -6040,6 +6040,21 @@
           <w:rFonts w:ascii="Calibri" w:hAnsi="Calibri" w:eastAsia="PingFang SC"/>
         </w:rPr>
         <w:t>：已先用 User12 × ChatGPT Deep Research 跑通 Full Persona、No-Ask 和 Free Clarification。P-score 分别为 6.703、5.596、6.033；InteractiveGain=+0.438，RecoveryRatio=39.53%。Interactive 的六问全部 task-relevant，但只恢复了内容方向、目标优先级、晨间/周末时间和 ROI；没有询问 founder/company role、技术资历、LinkedIn/GitHub/Slack/Notion、跨境与合规边界。该运行用于验证 end-to-end plumbing 和 acquisition-to-use 诊断，不替代 A/B pair、high/low/zero node、双人 qualification 或 matched/swapped 主评。</w:t>
+      </w:r>
+    </w:p>
+    <w:p>
+      <w:r>
+        <w:rPr>
+          <w:rFonts w:ascii="Calibri" w:hAnsi="Calibri" w:eastAsia="PingFang SC"/>
+          <w:b/>
+        </w:rPr>
+        <w:t>v0.66 双 agent 运行结果</w:t>
+      </w:r>
+      <w:r>
+        <w:rPr>
+          <w:rFonts w:ascii="Calibri" w:hAnsi="Calibri" w:eastAsia="PingFang SC"/>
+        </w:rPr>
+        <w:t>：PDR-T01 × User1 上，ChatGPT Deep Research 与 Gemini Deep Research 接收相同的 instruction-only + free-clarification 输入。ChatGPT 一轮 15 个 atomic slots 覆盖 7/7 个预冻结 critical preference clusters；Gemini 没有提问，asked-cluster Jaccard=0。原始 34 条 PDR criteria 的盲化三重复 P-score 为 7.057 对 6.065，差 +0.992。最大差距出现在方向验证、fit-based shortlist 和可衡量背景提升；Gemini 在通用地区比较与就业信息上更强。该结果只证明 agent-system clarification policy 可以不同；模型、planner、搜索和生成策略同时变化，不能把分差单独归因于提问。</w:t>
       </w:r>
     </w:p>
     <w:p>
@@ -18821,7 +18836,7 @@
         <w:color w:val="5B6B7A"/>
         <w:sz w:val="18"/>
       </w:rPr>
-      <w:t xml:space="preserve">2026-9-5   ·   </w:t>
+      <w:t xml:space="preserve">2026-9-6   ·   </w:t>
     </w:r>
     <w:r>
       <w:rPr>
@@ -18854,7 +18869,7 @@
         <w:color w:val="5B6B7A"/>
         <w:sz w:val="18"/>
       </w:rPr>
-      <w:t xml:space="preserve">2026-9-5   ·   </w:t>
+      <w:t xml:space="preserve">2026-9-6   ·   </w:t>
     </w:r>
     <w:r>
       <w:rPr>
@@ -18887,7 +18902,7 @@
         <w:color w:val="5B6B7A"/>
         <w:sz w:val="18"/>
       </w:rPr>
-      <w:t xml:space="preserve">2026-9-5   ·   </w:t>
+      <w:t xml:space="preserve">2026-9-6   ·   </w:t>
     </w:r>
     <w:r>
       <w:rPr>

</xml_diff>

<commit_message>
proposal v0.67: map PDR criteria to preference chains
</commit_message>
<xml_diff>
--- a/deliverables/AskInfer-Bench_两周执行Todo与任务手册.docx
+++ b/deliverables/AskInfer-Bench_两周执行Todo与任务手册.docx
@@ -131,7 +131,7 @@
                 <w:color w:val="5B6B7A"/>
                 <w:sz w:val="21"/>
               </w:rPr>
-              <w:t>v0.66 · PDR-T01 双 Agent 澄清 Pilot</w:t>
+              <w:t>v0.67 · PDR-T30 Preference Chain</w:t>
             </w:r>
           </w:p>
         </w:tc>
@@ -6055,6 +6055,49 @@
           <w:rFonts w:ascii="Calibri" w:hAnsi="Calibri" w:eastAsia="PingFang SC"/>
         </w:rPr>
         <w:t>：PDR-T01 × User1 上，ChatGPT Deep Research 与 Gemini Deep Research 接收相同的 instruction-only + free-clarification 输入。ChatGPT 一轮 15 个 atomic slots 覆盖 7/7 个预冻结 critical preference clusters；Gemini 没有提问，asked-cluster Jaccard=0。原始 34 条 PDR criteria 的盲化三重复 P-score 为 7.057 对 6.065，差 +0.992。最大差距出现在方向验证、fit-based shortlist 和可衡量背景提升；Gemini 在通用地区比较与就业信息上更强。该结果只证明 agent-system clarification policy 可以不同；模型、planner、搜索和生成策略同时变化，不能把分差单独归因于提问。</w:t>
+      </w:r>
+    </w:p>
+    <w:p>
+      <w:r>
+        <w:rPr>
+          <w:rFonts w:ascii="Calibri" w:hAnsi="Calibri" w:eastAsia="PingFang SC"/>
+          <w:b/>
+        </w:rPr>
+        <w:t>v0.67 preference-chain 结果</w:t>
+      </w:r>
+      <w:r>
+        <w:rPr>
+          <w:rFonts w:ascii="Calibri" w:hAnsi="Calibri" w:eastAsia="PingFang SC"/>
+        </w:rPr>
+        <w:t xml:space="preserve">：PDR-T30 的 44 条 criteria 已全部映射到 22 个 atomic preference units，并给 Interactive/Full 分别编码 </w:t>
+      </w:r>
+      <w:r>
+        <w:rPr>
+          <w:rFonts w:ascii="Courier New" w:hAnsi="Courier New" w:eastAsia="PingFang SC"/>
+          <w:color w:val="6A3E00"/>
+          <w:sz w:val="20"/>
+        </w:rPr>
+        <w:t>relevant、known、asked、resolved、reflected</w:t>
+      </w:r>
+      <w:r>
+        <w:rPr>
+          <w:rFonts w:ascii="Calibri" w:hAnsi="Calibri" w:eastAsia="PingFang SC"/>
+        </w:rPr>
+        <w:t xml:space="preserve">。Interactive 六问覆盖 11/22，严格完成全链 5/22；Full 首轮前 known 14/22。Full 五问均针对 persona 未定义的 residual value，判为 redundant 0/5、reasonable verification 5/5；simulator 没有新增可解决答案。运行 </w:t>
+      </w:r>
+      <w:r>
+        <w:rPr>
+          <w:rFonts w:ascii="Courier New" w:hAnsi="Courier New" w:eastAsia="PingFang SC"/>
+          <w:color w:val="6A3E00"/>
+          <w:sz w:val="20"/>
+        </w:rPr>
+        <w:t>node pilot/pdr_interactive_personalization_pilot_01/evaluation/validate_preference_mapping.mjs</w:t>
+      </w:r>
+      <w:r>
+        <w:rPr>
+          <w:rFonts w:ascii="Calibri" w:hAnsi="Calibri" w:eastAsia="PingFang SC"/>
+        </w:rPr>
+        <w:t xml:space="preserve"> 必须得到 44 criteria、22 units、11 questions、primary mass=1 的 PASS。下一门是第二位 coder 在不看当前标签时独立映射，再报告 unit/mapping/status agreement；未完成前不能把 22-unit recall 当确认性结果。</w:t>
       </w:r>
     </w:p>
     <w:p>

</xml_diff>

<commit_message>
proposal v0.69: add 50-percent clarification follow-up
</commit_message>
<xml_diff>
--- a/deliverables/AskInfer-Bench_两周执行Todo与任务手册.docx
+++ b/deliverables/AskInfer-Bench_两周执行Todo与任务手册.docx
@@ -131,7 +131,7 @@
                 <w:color w:val="5B6B7A"/>
                 <w:sz w:val="21"/>
               </w:rPr>
-              <w:t>v0.67 · PDR-T30 Preference Chain</w:t>
+              <w:t>v0.68 · Ask What Matters Pilot</w:t>
             </w:r>
           </w:p>
         </w:tc>
@@ -189,7 +189,7 @@
                 <w:color w:val="5B6B7A"/>
                 <w:sz w:val="21"/>
               </w:rPr>
-              <w:t>2026 年 9 月 6 日</w:t>
+              <w:t>2026 年 9 月 8 日</w:t>
             </w:r>
           </w:p>
         </w:tc>
@@ -500,6 +500,8 @@
         <w:sectPr>
           <w:headerReference w:type="default" r:id="rId9"/>
           <w:footerReference w:type="default" r:id="rId10"/>
+          <w:headerReference w:type="even" r:id="rId11"/>
+          <w:footerReference w:type="even" r:id="rId12"/>
           <w:pgSz w:w="12240" w:h="15840"/>
           <w:pgMar w:top="1080" w:right="1080" w:bottom="1080" w:left="1080" w:header="708" w:footer="708" w:gutter="0"/>
           <w:cols w:space="720"/>
@@ -543,7 +545,7 @@
                     <pic:cNvPicPr/>
                   </pic:nvPicPr>
                   <pic:blipFill>
-                    <a:blip r:embed="rId13"/>
+                    <a:blip r:embed="rId17"/>
                     <a:stretch>
                       <a:fillRect/>
                     </a:stretch>
@@ -580,8 +582,10 @@
     <w:p>
       <w:pPr>
         <w:sectPr>
-          <w:headerReference w:type="default" r:id="rId11"/>
-          <w:footerReference w:type="default" r:id="rId12"/>
+          <w:headerReference w:type="default" r:id="rId13"/>
+          <w:footerReference w:type="default" r:id="rId14"/>
+          <w:headerReference w:type="even" r:id="rId15"/>
+          <w:footerReference w:type="even" r:id="rId16"/>
           <w:pgSz w:w="15840" w:h="12240" w:orient="landscape"/>
           <w:pgMar w:top="936" w:right="936" w:bottom="936" w:left="936" w:header="708" w:footer="708" w:gutter="0"/>
           <w:cols w:space="720"/>
@@ -1553,7 +1557,7 @@
         </w:rPr>
         <w:t>PDR-Bench 主要给 agent 完整 task 与完整 structured persona，评价完整信息已给出后能否生成适配报告；其贡献是 full-context personalized deep research。</w:t>
       </w:r>
-      <w:hyperlink r:id="rId16">
+      <w:hyperlink r:id="rId22">
         <w:r>
           <w:rPr>
             <w:rFonts w:ascii="Calibri" w:hAnsi="Calibri" w:eastAsia="PingFang SC"/>
@@ -6101,6 +6105,35 @@
       </w:r>
     </w:p>
     <w:p>
+      <w:r>
+        <w:rPr>
+          <w:rFonts w:ascii="Calibri" w:hAnsi="Calibri" w:eastAsia="PingFang SC"/>
+          <w:b/>
+        </w:rPr>
+        <w:t>v0.68 Ask What Matters 结果</w:t>
+      </w:r>
+      <w:r>
+        <w:rPr>
+          <w:rFonts w:ascii="Calibri" w:hAnsi="Calibri" w:eastAsia="PingFang SC"/>
+        </w:rPr>
+        <w:t xml:space="preserve">：PDR-T35 × User8 先冻结 8 个 task-specific preference units（3 high、3 medium、2 low，权重 17），再让 ChatGPT research-capable 配置与 Gemini Deep Research 接收 byte-identical 的 instruction-only + free-clarification 输入。两边都是 0 个 task-specific question，三个 recall、weighted coverage、turns 和 answer tokens 全为 0；原始 37 条 criteria 的盲化三重复均值为 5.5383 与 5.7033。当前失败点是没有启动 elicitation，不是问而未解、答而未用或低价值 over-asking。运行 </w:t>
+      </w:r>
+      <w:r>
+        <w:rPr>
+          <w:rFonts w:ascii="Courier New" w:hAnsi="Courier New" w:eastAsia="PingFang SC"/>
+          <w:color w:val="6A3E00"/>
+          <w:sz w:val="20"/>
+        </w:rPr>
+        <w:t>python3 pilot/pilot_02_ask_what_matters/validate_pilot.py</w:t>
+      </w:r>
+      <w:r>
+        <w:rPr>
+          <w:rFonts w:ascii="Calibri" w:hAnsi="Calibri" w:eastAsia="PingFang SC"/>
+        </w:rPr>
+        <w:t xml:space="preserve"> 必须验证 8-unit 冻结、6 个 evaluator outputs、37 条 criteria 顺序与 16 行 preference chain。不要据此扩到 15 DR + 15 Data；先增加少量 generation repeats，并验证产品能在研究前自然暂停提问。</w:t>
+      </w:r>
+    </w:p>
+    <w:p>
       <w:pPr>
         <w:pStyle w:val="Heading2"/>
       </w:pPr>
@@ -16729,7 +16762,7 @@
         </w:rPr>
         <w:t>ICLR 2027 要求 2026-09-18 11:59 PM AOE 前提交真实、信息充分、能反映最终论文的摘要；全文截止为 2026-09-25 11:59 PM AOE。标题与摘要可在全文截止前修改，但不能改成另一篇论文；摘要截止后不能新增作者。</w:t>
       </w:r>
-      <w:hyperlink r:id="rId17">
+      <w:hyperlink r:id="rId23">
         <w:r>
           <w:rPr>
             <w:rFonts w:ascii="Calibri" w:hAnsi="Calibri" w:eastAsia="PingFang SC"/>
@@ -18799,7 +18832,7 @@
         </w:rPr>
         <w:t xml:space="preserve">. </w:t>
       </w:r>
-      <w:hyperlink r:id="rId16">
+      <w:hyperlink r:id="rId22">
         <w:r>
           <w:rPr>
             <w:rFonts w:ascii="Calibri" w:hAnsi="Calibri" w:eastAsia="PingFang SC"/>
@@ -18839,7 +18872,7 @@
         </w:rPr>
         <w:t xml:space="preserve">. </w:t>
       </w:r>
-      <w:hyperlink r:id="rId17">
+      <w:hyperlink r:id="rId23">
         <w:r>
           <w:rPr>
             <w:rFonts w:ascii="Calibri" w:hAnsi="Calibri" w:eastAsia="PingFang SC"/>
@@ -18853,8 +18886,10 @@
       </w:hyperlink>
     </w:p>
     <w:sectPr>
-      <w:headerReference w:type="default" r:id="rId14"/>
-      <w:footerReference w:type="default" r:id="rId15"/>
+      <w:headerReference w:type="default" r:id="rId18"/>
+      <w:footerReference w:type="default" r:id="rId19"/>
+      <w:headerReference w:type="even" r:id="rId20"/>
+      <w:footerReference w:type="even" r:id="rId21"/>
       <w:pgSz w:w="12240" w:h="15840"/>
       <w:pgMar w:top="1080" w:right="1080" w:bottom="1080" w:left="1080" w:header="708" w:footer="708" w:gutter="0"/>
       <w:cols w:space="720"/>
@@ -18879,7 +18914,7 @@
         <w:color w:val="5B6B7A"/>
         <w:sz w:val="18"/>
       </w:rPr>
-      <w:t xml:space="preserve">2026-9-6   ·   </w:t>
+      <w:t xml:space="preserve">2026-9-8   ·   </w:t>
     </w:r>
     <w:r>
       <w:rPr>
@@ -18912,7 +18947,7 @@
         <w:color w:val="5B6B7A"/>
         <w:sz w:val="18"/>
       </w:rPr>
-      <w:t xml:space="preserve">2026-9-6   ·   </w:t>
+      <w:t xml:space="preserve">2026-9-8   ·   </w:t>
     </w:r>
     <w:r>
       <w:rPr>
@@ -18945,7 +18980,106 @@
         <w:color w:val="5B6B7A"/>
         <w:sz w:val="18"/>
       </w:rPr>
-      <w:t xml:space="preserve">2026-9-6   ·   </w:t>
+      <w:t xml:space="preserve">2026-9-8   ·   </w:t>
+    </w:r>
+    <w:r>
+      <w:rPr>
+        <w:rFonts w:ascii="Calibri" w:hAnsi="Calibri" w:eastAsia="PingFang SC"/>
+        <w:color w:val="5B6B7A"/>
+        <w:sz w:val="18"/>
+      </w:rPr>
+      <w:fldChar w:fldCharType="begin"/>
+      <w:instrText xml:space="preserve">PAGE</w:instrText>
+      <w:fldChar w:fldCharType="separate"/>
+      <w:t>1</w:t>
+      <w:fldChar w:fldCharType="end"/>
+    </w:r>
+  </w:p>
+</w:ftr>
+</file>
+
+<file path=word/footer4.xml><?xml version="1.0" encoding="utf-8"?>
+<w:ftr xmlns:m="http://schemas.openxmlformats.org/officeDocument/2006/math" xmlns:mc="http://schemas.openxmlformats.org/markup-compatibility/2006" xmlns:mo="http://schemas.microsoft.com/office/mac/office/2008/main" xmlns:mv="urn:schemas-microsoft-com:mac:vml" xmlns:o="urn:schemas-microsoft-com:office:office" xmlns:r="http://schemas.openxmlformats.org/officeDocument/2006/relationships" xmlns:v="urn:schemas-microsoft-com:vml" xmlns:w10="urn:schemas-microsoft-com:office:word" xmlns:w14="http://schemas.microsoft.com/office/word/2010/wordml" xmlns:w="http://schemas.openxmlformats.org/wordprocessingml/2006/main" xmlns:wne="http://schemas.microsoft.com/office/word/2006/wordml" xmlns:wp14="http://schemas.microsoft.com/office/word/2010/wordprocessingDrawing" xmlns:wp="http://schemas.openxmlformats.org/drawingml/2006/wordprocessingDrawing" xmlns:wpc="http://schemas.microsoft.com/office/word/2010/wordprocessingCanvas" xmlns:wpg="http://schemas.microsoft.com/office/word/2010/wordprocessingGroup" xmlns:wpi="http://schemas.microsoft.com/office/word/2010/wordprocessingInk" xmlns:wps="http://schemas.microsoft.com/office/word/2010/wordprocessingShape" mc:Ignorable="w14 wp14">
+  <w:p>
+    <w:pPr>
+      <w:pStyle w:val="Footer"/>
+      <w:spacing w:before="0"/>
+      <w:jc w:val="right"/>
+    </w:pPr>
+    <w:r/>
+    <w:r>
+      <w:rPr>
+        <w:rFonts w:ascii="Calibri" w:hAnsi="Calibri" w:eastAsia="PingFang SC"/>
+        <w:color w:val="5B6B7A"/>
+        <w:sz w:val="18"/>
+      </w:rPr>
+      <w:t xml:space="preserve">2026-9-8   ·   </w:t>
+    </w:r>
+    <w:r>
+      <w:rPr>
+        <w:rFonts w:ascii="Calibri" w:hAnsi="Calibri" w:eastAsia="PingFang SC"/>
+        <w:color w:val="5B6B7A"/>
+        <w:sz w:val="18"/>
+      </w:rPr>
+      <w:fldChar w:fldCharType="begin"/>
+      <w:instrText xml:space="preserve">PAGE</w:instrText>
+      <w:fldChar w:fldCharType="separate"/>
+      <w:t>1</w:t>
+      <w:fldChar w:fldCharType="end"/>
+    </w:r>
+  </w:p>
+</w:ftr>
+</file>
+
+<file path=word/footer5.xml><?xml version="1.0" encoding="utf-8"?>
+<w:ftr xmlns:m="http://schemas.openxmlformats.org/officeDocument/2006/math" xmlns:mc="http://schemas.openxmlformats.org/markup-compatibility/2006" xmlns:mo="http://schemas.microsoft.com/office/mac/office/2008/main" xmlns:mv="urn:schemas-microsoft-com:mac:vml" xmlns:o="urn:schemas-microsoft-com:office:office" xmlns:r="http://schemas.openxmlformats.org/officeDocument/2006/relationships" xmlns:v="urn:schemas-microsoft-com:vml" xmlns:w10="urn:schemas-microsoft-com:office:word" xmlns:w14="http://schemas.microsoft.com/office/word/2010/wordml" xmlns:w="http://schemas.openxmlformats.org/wordprocessingml/2006/main" xmlns:wne="http://schemas.microsoft.com/office/word/2006/wordml" xmlns:wp14="http://schemas.microsoft.com/office/word/2010/wordprocessingDrawing" xmlns:wp="http://schemas.openxmlformats.org/drawingml/2006/wordprocessingDrawing" xmlns:wpc="http://schemas.microsoft.com/office/word/2010/wordprocessingCanvas" xmlns:wpg="http://schemas.microsoft.com/office/word/2010/wordprocessingGroup" xmlns:wpi="http://schemas.microsoft.com/office/word/2010/wordprocessingInk" xmlns:wps="http://schemas.microsoft.com/office/word/2010/wordprocessingShape" mc:Ignorable="w14 wp14">
+  <w:p>
+    <w:pPr>
+      <w:pStyle w:val="Footer"/>
+      <w:spacing w:before="0"/>
+      <w:jc w:val="right"/>
+    </w:pPr>
+    <w:r/>
+    <w:r>
+      <w:rPr>
+        <w:rFonts w:ascii="Calibri" w:hAnsi="Calibri" w:eastAsia="PingFang SC"/>
+        <w:color w:val="5B6B7A"/>
+        <w:sz w:val="18"/>
+      </w:rPr>
+      <w:t xml:space="preserve">2026-9-8   ·   </w:t>
+    </w:r>
+    <w:r>
+      <w:rPr>
+        <w:rFonts w:ascii="Calibri" w:hAnsi="Calibri" w:eastAsia="PingFang SC"/>
+        <w:color w:val="5B6B7A"/>
+        <w:sz w:val="18"/>
+      </w:rPr>
+      <w:fldChar w:fldCharType="begin"/>
+      <w:instrText xml:space="preserve">PAGE</w:instrText>
+      <w:fldChar w:fldCharType="separate"/>
+      <w:t>1</w:t>
+      <w:fldChar w:fldCharType="end"/>
+    </w:r>
+  </w:p>
+</w:ftr>
+</file>
+
+<file path=word/footer6.xml><?xml version="1.0" encoding="utf-8"?>
+<w:ftr xmlns:m="http://schemas.openxmlformats.org/officeDocument/2006/math" xmlns:mc="http://schemas.openxmlformats.org/markup-compatibility/2006" xmlns:mo="http://schemas.microsoft.com/office/mac/office/2008/main" xmlns:mv="urn:schemas-microsoft-com:mac:vml" xmlns:o="urn:schemas-microsoft-com:office:office" xmlns:r="http://schemas.openxmlformats.org/officeDocument/2006/relationships" xmlns:v="urn:schemas-microsoft-com:vml" xmlns:w10="urn:schemas-microsoft-com:office:word" xmlns:w14="http://schemas.microsoft.com/office/word/2010/wordml" xmlns:w="http://schemas.openxmlformats.org/wordprocessingml/2006/main" xmlns:wne="http://schemas.microsoft.com/office/word/2006/wordml" xmlns:wp14="http://schemas.microsoft.com/office/word/2010/wordprocessingDrawing" xmlns:wp="http://schemas.openxmlformats.org/drawingml/2006/wordprocessingDrawing" xmlns:wpc="http://schemas.microsoft.com/office/word/2010/wordprocessingCanvas" xmlns:wpg="http://schemas.microsoft.com/office/word/2010/wordprocessingGroup" xmlns:wpi="http://schemas.microsoft.com/office/word/2010/wordprocessingInk" xmlns:wps="http://schemas.microsoft.com/office/word/2010/wordprocessingShape" mc:Ignorable="w14 wp14">
+  <w:p>
+    <w:pPr>
+      <w:pStyle w:val="Footer"/>
+      <w:spacing w:before="0"/>
+      <w:jc w:val="right"/>
+    </w:pPr>
+    <w:r/>
+    <w:r>
+      <w:rPr>
+        <w:rFonts w:ascii="Calibri" w:hAnsi="Calibri" w:eastAsia="PingFang SC"/>
+        <w:color w:val="5B6B7A"/>
+        <w:sz w:val="18"/>
+      </w:rPr>
+      <w:t xml:space="preserve">2026-9-8   ·   </w:t>
     </w:r>
     <w:r>
       <w:rPr>
@@ -18971,15 +19105,7 @@
       <w:spacing w:after="0"/>
       <w:jc w:val="left"/>
     </w:pPr>
-    <w:r>
-      <w:rPr>
-        <w:rFonts w:ascii="Calibri" w:hAnsi="Calibri" w:eastAsia="PingFang SC"/>
-        <w:b/>
-        <w:color w:val="5B6B7A"/>
-        <w:sz w:val="17"/>
-      </w:rPr>
-      <w:t>ASKINFER-BENCH  ·  TWO-WEEK EXECUTION PLAYBOOK</w:t>
-    </w:r>
+    <w:r/>
   </w:p>
 </w:hdr>
 </file>
@@ -18992,15 +19118,7 @@
       <w:spacing w:after="0"/>
       <w:jc w:val="left"/>
     </w:pPr>
-    <w:r>
-      <w:rPr>
-        <w:rFonts w:ascii="Calibri" w:hAnsi="Calibri" w:eastAsia="PingFang SC"/>
-        <w:b/>
-        <w:color w:val="5B6B7A"/>
-        <w:sz w:val="17"/>
-      </w:rPr>
-      <w:t>ASKINFER-BENCH  ·  TWO-WEEK EXECUTION PLAYBOOK</w:t>
-    </w:r>
+    <w:r/>
   </w:p>
 </w:hdr>
 </file>
@@ -19013,15 +19131,46 @@
       <w:spacing w:after="0"/>
       <w:jc w:val="left"/>
     </w:pPr>
-    <w:r>
-      <w:rPr>
-        <w:rFonts w:ascii="Calibri" w:hAnsi="Calibri" w:eastAsia="PingFang SC"/>
-        <w:b/>
-        <w:color w:val="5B6B7A"/>
-        <w:sz w:val="17"/>
-      </w:rPr>
-      <w:t>ASKINFER-BENCH  ·  TWO-WEEK EXECUTION PLAYBOOK</w:t>
-    </w:r>
+    <w:r/>
+  </w:p>
+</w:hdr>
+</file>
+
+<file path=word/header4.xml><?xml version="1.0" encoding="utf-8"?>
+<w:hdr xmlns:m="http://schemas.openxmlformats.org/officeDocument/2006/math" xmlns:mc="http://schemas.openxmlformats.org/markup-compatibility/2006" xmlns:mo="http://schemas.microsoft.com/office/mac/office/2008/main" xmlns:mv="urn:schemas-microsoft-com:mac:vml" xmlns:o="urn:schemas-microsoft-com:office:office" xmlns:r="http://schemas.openxmlformats.org/officeDocument/2006/relationships" xmlns:v="urn:schemas-microsoft-com:vml" xmlns:w10="urn:schemas-microsoft-com:office:word" xmlns:w14="http://schemas.microsoft.com/office/word/2010/wordml" xmlns:w="http://schemas.openxmlformats.org/wordprocessingml/2006/main" xmlns:wne="http://schemas.microsoft.com/office/word/2006/wordml" xmlns:wp14="http://schemas.microsoft.com/office/word/2010/wordprocessingDrawing" xmlns:wp="http://schemas.openxmlformats.org/drawingml/2006/wordprocessingDrawing" xmlns:wpc="http://schemas.microsoft.com/office/word/2010/wordprocessingCanvas" xmlns:wpg="http://schemas.microsoft.com/office/word/2010/wordprocessingGroup" xmlns:wpi="http://schemas.microsoft.com/office/word/2010/wordprocessingInk" xmlns:wps="http://schemas.microsoft.com/office/word/2010/wordprocessingShape" mc:Ignorable="w14 wp14">
+  <w:p>
+    <w:pPr>
+      <w:pStyle w:val="Header"/>
+      <w:spacing w:after="0"/>
+      <w:jc w:val="left"/>
+    </w:pPr>
+    <w:r/>
+  </w:p>
+</w:hdr>
+</file>
+
+<file path=word/header5.xml><?xml version="1.0" encoding="utf-8"?>
+<w:hdr xmlns:m="http://schemas.openxmlformats.org/officeDocument/2006/math" xmlns:mc="http://schemas.openxmlformats.org/markup-compatibility/2006" xmlns:mo="http://schemas.microsoft.com/office/mac/office/2008/main" xmlns:mv="urn:schemas-microsoft-com:mac:vml" xmlns:o="urn:schemas-microsoft-com:office:office" xmlns:r="http://schemas.openxmlformats.org/officeDocument/2006/relationships" xmlns:v="urn:schemas-microsoft-com:vml" xmlns:w10="urn:schemas-microsoft-com:office:word" xmlns:w14="http://schemas.microsoft.com/office/word/2010/wordml" xmlns:w="http://schemas.openxmlformats.org/wordprocessingml/2006/main" xmlns:wne="http://schemas.microsoft.com/office/word/2006/wordml" xmlns:wp14="http://schemas.microsoft.com/office/word/2010/wordprocessingDrawing" xmlns:wp="http://schemas.openxmlformats.org/drawingml/2006/wordprocessingDrawing" xmlns:wpc="http://schemas.microsoft.com/office/word/2010/wordprocessingCanvas" xmlns:wpg="http://schemas.microsoft.com/office/word/2010/wordprocessingGroup" xmlns:wpi="http://schemas.microsoft.com/office/word/2010/wordprocessingInk" xmlns:wps="http://schemas.microsoft.com/office/word/2010/wordprocessingShape" mc:Ignorable="w14 wp14">
+  <w:p>
+    <w:pPr>
+      <w:pStyle w:val="Header"/>
+      <w:spacing w:after="0"/>
+      <w:jc w:val="left"/>
+    </w:pPr>
+    <w:r/>
+  </w:p>
+</w:hdr>
+</file>
+
+<file path=word/header6.xml><?xml version="1.0" encoding="utf-8"?>
+<w:hdr xmlns:m="http://schemas.openxmlformats.org/officeDocument/2006/math" xmlns:mc="http://schemas.openxmlformats.org/markup-compatibility/2006" xmlns:mo="http://schemas.microsoft.com/office/mac/office/2008/main" xmlns:mv="urn:schemas-microsoft-com:mac:vml" xmlns:o="urn:schemas-microsoft-com:office:office" xmlns:r="http://schemas.openxmlformats.org/officeDocument/2006/relationships" xmlns:v="urn:schemas-microsoft-com:vml" xmlns:w10="urn:schemas-microsoft-com:office:word" xmlns:w14="http://schemas.microsoft.com/office/word/2010/wordml" xmlns:w="http://schemas.openxmlformats.org/wordprocessingml/2006/main" xmlns:wne="http://schemas.microsoft.com/office/word/2006/wordml" xmlns:wp14="http://schemas.microsoft.com/office/word/2010/wordprocessingDrawing" xmlns:wp="http://schemas.openxmlformats.org/drawingml/2006/wordprocessingDrawing" xmlns:wpc="http://schemas.microsoft.com/office/word/2010/wordprocessingCanvas" xmlns:wpg="http://schemas.microsoft.com/office/word/2010/wordprocessingGroup" xmlns:wpi="http://schemas.microsoft.com/office/word/2010/wordprocessingInk" xmlns:wps="http://schemas.microsoft.com/office/word/2010/wordprocessingShape" mc:Ignorable="w14 wp14">
+  <w:p>
+    <w:pPr>
+      <w:pStyle w:val="Header"/>
+      <w:spacing w:after="0"/>
+      <w:jc w:val="left"/>
+    </w:pPr>
+    <w:r/>
   </w:p>
 </w:hdr>
 </file>

</xml_diff>